<commit_message>
Add final Persian project documentation and Grafana dashboards
</commit_message>
<xml_diff>
--- a/docs/Northwind_ETL_Project_Documentation_FA.docx
+++ b/docs/Northwind_ETL_Project_Documentation_FA.docx
@@ -10,8 +10,8 @@
           <w:b/>
           <w:bCs/>
           <w:color w:val="215E99" w:themeColor="text2" w:themeTint="BF"/>
-          <w:sz w:val="32"/>
-          <w:szCs w:val="32"/>
+          <w:sz w:val="36"/>
+          <w:szCs w:val="36"/>
           <w:rtl/>
         </w:rPr>
       </w:pPr>
@@ -21,8 +21,8 @@
           <w:b/>
           <w:bCs/>
           <w:color w:val="215E99" w:themeColor="text2" w:themeTint="BF"/>
-          <w:sz w:val="32"/>
-          <w:szCs w:val="32"/>
+          <w:sz w:val="36"/>
+          <w:szCs w:val="36"/>
           <w:highlight w:val="lightGray"/>
           <w:rtl/>
         </w:rPr>
@@ -34,8 +34,8 @@
           <w:b/>
           <w:bCs/>
           <w:color w:val="215E99" w:themeColor="text2" w:themeTint="BF"/>
-          <w:sz w:val="32"/>
-          <w:szCs w:val="32"/>
+          <w:sz w:val="36"/>
+          <w:szCs w:val="36"/>
           <w:highlight w:val="lightGray"/>
           <w:rtl/>
         </w:rPr>
@@ -47,8 +47,8 @@
           <w:b/>
           <w:bCs/>
           <w:color w:val="215E99" w:themeColor="text2" w:themeTint="BF"/>
-          <w:sz w:val="32"/>
-          <w:szCs w:val="32"/>
+          <w:sz w:val="36"/>
+          <w:szCs w:val="36"/>
           <w:highlight w:val="lightGray"/>
           <w:rtl/>
         </w:rPr>
@@ -60,8 +60,8 @@
           <w:b/>
           <w:bCs/>
           <w:color w:val="215E99" w:themeColor="text2" w:themeTint="BF"/>
-          <w:sz w:val="32"/>
-          <w:szCs w:val="32"/>
+          <w:sz w:val="36"/>
+          <w:szCs w:val="36"/>
           <w:highlight w:val="lightGray"/>
         </w:rPr>
         <w:t xml:space="preserve"> </w:t>
@@ -72,8 +72,8 @@
           <w:b/>
           <w:bCs/>
           <w:color w:val="215E99" w:themeColor="text2" w:themeTint="BF"/>
-          <w:sz w:val="28"/>
-          <w:szCs w:val="28"/>
+          <w:sz w:val="36"/>
+          <w:szCs w:val="36"/>
           <w:highlight w:val="lightGray"/>
         </w:rPr>
         <w:t>Northwind ETL / Data Warehous</w:t>
@@ -84,8 +84,8 @@
           <w:b/>
           <w:bCs/>
           <w:color w:val="215E99" w:themeColor="text2" w:themeTint="BF"/>
-          <w:sz w:val="28"/>
-          <w:szCs w:val="28"/>
+          <w:sz w:val="36"/>
+          <w:szCs w:val="36"/>
           <w:highlight w:val="lightGray"/>
         </w:rPr>
         <w:t>e</w:t>
@@ -1762,6 +1762,7 @@
           <w:bCs/>
           <w:sz w:val="32"/>
           <w:szCs w:val="32"/>
+          <w:rtl/>
         </w:rPr>
       </w:pPr>
       <w:r>
@@ -6151,19 +6152,555 @@
     </w:p>
     <w:p>
       <w:pPr>
+        <w:rPr>
+          <w:rFonts w:cs="B Nazanin"/>
+          <w:b/>
+          <w:bCs/>
+          <w:color w:val="4C94D8" w:themeColor="text2" w:themeTint="80"/>
+          <w:sz w:val="32"/>
+          <w:szCs w:val="32"/>
+        </w:rPr>
+      </w:pPr>
+    </w:p>
+    <w:p>
+      <w:pPr>
+        <w:rPr>
+          <w:color w:val="BF4E14" w:themeColor="accent2" w:themeShade="BF"/>
+          <w:sz w:val="28"/>
+          <w:szCs w:val="28"/>
+        </w:rPr>
+      </w:pPr>
+      <w:r>
+        <w:rPr>
+          <w:rFonts w:hint="cs"/>
+          <w:b/>
+          <w:color w:val="BF4E14" w:themeColor="accent2" w:themeShade="BF"/>
+          <w:sz w:val="28"/>
+          <w:szCs w:val="28"/>
+          <w:rtl/>
+        </w:rPr>
+        <w:lastRenderedPageBreak/>
+        <w:t>13</w:t>
+      </w:r>
+      <w:r>
+        <w:rPr>
+          <w:b/>
+          <w:color w:val="BF4E14" w:themeColor="accent2" w:themeShade="BF"/>
+          <w:sz w:val="28"/>
+          <w:szCs w:val="28"/>
+        </w:rPr>
+        <w:t>.</w:t>
+      </w:r>
+      <w:r>
+        <w:rPr>
+          <w:rFonts w:hint="cs"/>
+          <w:b/>
+          <w:color w:val="BF4E14" w:themeColor="accent2" w:themeShade="BF"/>
+          <w:sz w:val="28"/>
+          <w:szCs w:val="28"/>
+          <w:rtl/>
+        </w:rPr>
+        <w:t xml:space="preserve">1-  </w:t>
+      </w:r>
+      <w:r>
+        <w:rPr>
+          <w:b/>
+          <w:color w:val="BF4E14" w:themeColor="accent2" w:themeShade="BF"/>
+          <w:sz w:val="28"/>
+          <w:szCs w:val="28"/>
+        </w:rPr>
+        <w:t>Northwind - Employee &amp; Operations Analysis</w:t>
+      </w:r>
+    </w:p>
+    <w:p/>
+    <w:p>
+      <w:pPr>
+        <w:jc w:val="center"/>
+      </w:pPr>
+      <w:r>
+        <w:rPr>
+          <w:noProof/>
+        </w:rPr>
+        <w:drawing>
+          <wp:inline distT="0" distB="0" distL="0" distR="0" wp14:anchorId="151EDE27" wp14:editId="32694A61">
+            <wp:extent cx="5943600" cy="3352165"/>
+            <wp:effectExtent l="0" t="0" r="0" b="635"/>
+            <wp:docPr id="1093378512" name="Picture 1"/>
+            <wp:cNvGraphicFramePr>
+              <a:graphicFrameLocks xmlns:a="http://schemas.openxmlformats.org/drawingml/2006/main" noChangeAspect="1"/>
+            </wp:cNvGraphicFramePr>
+            <a:graphic xmlns:a="http://schemas.openxmlformats.org/drawingml/2006/main">
+              <a:graphicData uri="http://schemas.openxmlformats.org/drawingml/2006/picture">
+                <pic:pic xmlns:pic="http://schemas.openxmlformats.org/drawingml/2006/picture">
+                  <pic:nvPicPr>
+                    <pic:cNvPr id="1093378512" name="Picture 1093378512"/>
+                    <pic:cNvPicPr/>
+                  </pic:nvPicPr>
+                  <pic:blipFill>
+                    <a:blip r:embed="rId6" cstate="print">
+                      <a:extLst>
+                        <a:ext uri="{28A0092B-C50C-407E-A947-70E740481C1C}">
+                          <a14:useLocalDpi xmlns:a14="http://schemas.microsoft.com/office/drawing/2010/main" val="0"/>
+                        </a:ext>
+                      </a:extLst>
+                    </a:blip>
+                    <a:stretch>
+                      <a:fillRect/>
+                    </a:stretch>
+                  </pic:blipFill>
+                  <pic:spPr>
+                    <a:xfrm>
+                      <a:off x="0" y="0"/>
+                      <a:ext cx="5943600" cy="3352165"/>
+                    </a:xfrm>
+                    <a:prstGeom prst="rect">
+                      <a:avLst/>
+                    </a:prstGeom>
+                  </pic:spPr>
+                </pic:pic>
+              </a:graphicData>
+            </a:graphic>
+          </wp:inline>
+        </w:drawing>
+      </w:r>
+    </w:p>
+    <w:p>
+      <w:r>
+        <w:t>Sales by Employee: مجموع فروش خالص به تفکیک کارمند و برای مقایسه عملکرد فروش کارکنان.</w:t>
+      </w:r>
+    </w:p>
+    <w:p>
+      <w:r>
+        <w:t>Orders by Employee: تعداد سفارش‌های مرتبط با هر کارمند برای بررسی حجم فعالیت عملیاتی.</w:t>
+      </w:r>
+    </w:p>
+    <w:p>
+      <w:r>
+        <w:t>Freight by Employee: مجموع Freight مربوط به سفارش‌های هر کارمند برای تحلیل هزینه حمل.</w:t>
+      </w:r>
+    </w:p>
+    <w:p>
+      <w:r>
+        <w:t>Average Order Value: میانگین ارزش سفارش‌ها برای مقایسه ارزش اقتصادی سفارش‌های مدیریت‌شده توسط کارکنان.</w:t>
+      </w:r>
+    </w:p>
+    <w:p/>
+    <w:p>
+      <w:pPr>
+        <w:rPr>
+          <w:color w:val="BF4E14" w:themeColor="accent2" w:themeShade="BF"/>
+        </w:rPr>
+      </w:pPr>
+      <w:r>
+        <w:rPr>
+          <w:rFonts w:hint="cs"/>
+          <w:b/>
+          <w:color w:val="BF4E14" w:themeColor="accent2" w:themeShade="BF"/>
+          <w:sz w:val="28"/>
+          <w:szCs w:val="28"/>
+          <w:rtl/>
+        </w:rPr>
+        <w:t>13</w:t>
+      </w:r>
+      <w:r>
+        <w:rPr>
+          <w:b/>
+          <w:color w:val="BF4E14" w:themeColor="accent2" w:themeShade="BF"/>
+          <w:sz w:val="28"/>
+          <w:szCs w:val="28"/>
+        </w:rPr>
+        <w:t>.</w:t>
+      </w:r>
+      <w:r>
+        <w:rPr>
+          <w:rFonts w:hint="cs"/>
+          <w:b/>
+          <w:color w:val="BF4E14" w:themeColor="accent2" w:themeShade="BF"/>
+          <w:sz w:val="28"/>
+          <w:szCs w:val="28"/>
+          <w:rtl/>
+        </w:rPr>
+        <w:t>2</w:t>
+      </w:r>
+      <w:r>
+        <w:rPr>
+          <w:rFonts w:hint="cs"/>
+          <w:b/>
+          <w:color w:val="BF4E14" w:themeColor="accent2" w:themeShade="BF"/>
+          <w:sz w:val="28"/>
+          <w:szCs w:val="28"/>
+          <w:rtl/>
+        </w:rPr>
+        <w:t xml:space="preserve">-  </w:t>
+      </w:r>
+      <w:r>
+        <w:rPr>
+          <w:b/>
+          <w:color w:val="BF4E14" w:themeColor="accent2" w:themeShade="BF"/>
+          <w:sz w:val="26"/>
+        </w:rPr>
+        <w:t>Northwind - Product &amp; Customer Analysis</w:t>
+      </w:r>
+    </w:p>
+    <w:p>
+      <w:pPr>
+        <w:jc w:val="center"/>
+      </w:pPr>
+      <w:r>
+        <w:rPr>
+          <w:noProof/>
+        </w:rPr>
+        <w:lastRenderedPageBreak/>
+        <w:drawing>
+          <wp:inline distT="0" distB="0" distL="0" distR="0" wp14:anchorId="7E6E6C65" wp14:editId="6D4148DD">
+            <wp:extent cx="5806440" cy="3314320"/>
+            <wp:effectExtent l="0" t="0" r="0" b="0"/>
+            <wp:docPr id="1" name="Picture 1"/>
+            <wp:cNvGraphicFramePr>
+              <a:graphicFrameLocks xmlns:a="http://schemas.openxmlformats.org/drawingml/2006/main" noChangeAspect="1"/>
+            </wp:cNvGraphicFramePr>
+            <a:graphic xmlns:a="http://schemas.openxmlformats.org/drawingml/2006/main">
+              <a:graphicData uri="http://schemas.openxmlformats.org/drawingml/2006/picture">
+                <pic:pic xmlns:pic="http://schemas.openxmlformats.org/drawingml/2006/picture">
+                  <pic:nvPicPr>
+                    <pic:cNvPr id="0" name="Screenshot 2026-09-10 224041.png"/>
+                    <pic:cNvPicPr/>
+                  </pic:nvPicPr>
+                  <pic:blipFill>
+                    <a:blip r:embed="rId7"/>
+                    <a:stretch>
+                      <a:fillRect/>
+                    </a:stretch>
+                  </pic:blipFill>
+                  <pic:spPr>
+                    <a:xfrm>
+                      <a:off x="0" y="0"/>
+                      <a:ext cx="5806440" cy="3314320"/>
+                    </a:xfrm>
+                    <a:prstGeom prst="rect">
+                      <a:avLst/>
+                    </a:prstGeom>
+                  </pic:spPr>
+                </pic:pic>
+              </a:graphicData>
+            </a:graphic>
+          </wp:inline>
+        </w:drawing>
+      </w:r>
+    </w:p>
+    <w:p>
+      <w:pPr>
+        <w:jc w:val="center"/>
+      </w:pPr>
+      <w:r>
+        <w:rPr>
+          <w:i/>
+          <w:sz w:val="18"/>
+        </w:rPr>
+        <w:t>Screenshot واقعی Dashboard</w:t>
+      </w:r>
+    </w:p>
+    <w:p>
+      <w:r>
+        <w:t>Sales by Category: مقایسه فروش خالص به تفکیک Category برای شناسایی دسته‌های پرفروش.</w:t>
+      </w:r>
+    </w:p>
+    <w:p>
+      <w:r>
+        <w:t>Top 10 Products by Net Sales: نمایش ۱۰ محصول برتر بر اساس Net Sales.</w:t>
+      </w:r>
+    </w:p>
+    <w:p>
+      <w:r>
+        <w:t>Sales by Country: مقایسه فروش خالص به تفکیک کشور مشتریان.</w:t>
+      </w:r>
+    </w:p>
+    <w:p>
+      <w:r>
+        <w:t>Top 10 Customers by Net Sales: نمایش ۱۰ مشتری برتر بر اساس Net Sales.</w:t>
+      </w:r>
+    </w:p>
+    <w:p/>
+    <w:p>
+      <w:r>
+        <w:rPr>
+          <w:rFonts w:hint="cs"/>
+          <w:b/>
+          <w:color w:val="BF4E14" w:themeColor="accent2" w:themeShade="BF"/>
+          <w:sz w:val="28"/>
+          <w:szCs w:val="28"/>
+          <w:rtl/>
+        </w:rPr>
+        <w:t>13</w:t>
+      </w:r>
+      <w:r>
+        <w:rPr>
+          <w:b/>
+          <w:color w:val="BF4E14" w:themeColor="accent2" w:themeShade="BF"/>
+          <w:sz w:val="28"/>
+          <w:szCs w:val="28"/>
+        </w:rPr>
+        <w:t>.</w:t>
+      </w:r>
+      <w:r>
+        <w:rPr>
+          <w:rFonts w:hint="cs"/>
+          <w:b/>
+          <w:color w:val="BF4E14" w:themeColor="accent2" w:themeShade="BF"/>
+          <w:sz w:val="28"/>
+          <w:szCs w:val="28"/>
+          <w:rtl/>
+        </w:rPr>
+        <w:t>3</w:t>
+      </w:r>
+      <w:r>
+        <w:rPr>
+          <w:rFonts w:hint="cs"/>
+          <w:b/>
+          <w:color w:val="BF4E14" w:themeColor="accent2" w:themeShade="BF"/>
+          <w:sz w:val="28"/>
+          <w:szCs w:val="28"/>
+          <w:rtl/>
+        </w:rPr>
+        <w:t xml:space="preserve">-  </w:t>
+      </w:r>
+      <w:r>
+        <w:rPr>
+          <w:b/>
+          <w:color w:val="BF4E14" w:themeColor="accent2" w:themeShade="BF"/>
+          <w:sz w:val="26"/>
+        </w:rPr>
+        <w:t>Northwind - Sales Analysis</w:t>
+      </w:r>
+    </w:p>
+    <w:p>
+      <w:pPr>
+        <w:jc w:val="center"/>
+      </w:pPr>
+      <w:r>
+        <w:rPr>
+          <w:noProof/>
+        </w:rPr>
+        <w:lastRenderedPageBreak/>
+        <w:drawing>
+          <wp:inline distT="0" distB="0" distL="0" distR="0" wp14:anchorId="7C952EF5" wp14:editId="023763C5">
+            <wp:extent cx="5806440" cy="3254782"/>
+            <wp:effectExtent l="0" t="0" r="0" b="0"/>
+            <wp:docPr id="2" name="Picture 2"/>
+            <wp:cNvGraphicFramePr>
+              <a:graphicFrameLocks xmlns:a="http://schemas.openxmlformats.org/drawingml/2006/main" noChangeAspect="1"/>
+            </wp:cNvGraphicFramePr>
+            <a:graphic xmlns:a="http://schemas.openxmlformats.org/drawingml/2006/main">
+              <a:graphicData uri="http://schemas.openxmlformats.org/drawingml/2006/picture">
+                <pic:pic xmlns:pic="http://schemas.openxmlformats.org/drawingml/2006/picture">
+                  <pic:nvPicPr>
+                    <pic:cNvPr id="0" name="Screenshot 2026-09-10 224026.png"/>
+                    <pic:cNvPicPr/>
+                  </pic:nvPicPr>
+                  <pic:blipFill>
+                    <a:blip r:embed="rId8"/>
+                    <a:stretch>
+                      <a:fillRect/>
+                    </a:stretch>
+                  </pic:blipFill>
+                  <pic:spPr>
+                    <a:xfrm>
+                      <a:off x="0" y="0"/>
+                      <a:ext cx="5806440" cy="3254782"/>
+                    </a:xfrm>
+                    <a:prstGeom prst="rect">
+                      <a:avLst/>
+                    </a:prstGeom>
+                  </pic:spPr>
+                </pic:pic>
+              </a:graphicData>
+            </a:graphic>
+          </wp:inline>
+        </w:drawing>
+      </w:r>
+    </w:p>
+    <w:p>
+      <w:pPr>
+        <w:jc w:val="center"/>
+      </w:pPr>
+      <w:r>
+        <w:rPr>
+          <w:i/>
+          <w:sz w:val="18"/>
+        </w:rPr>
+        <w:t>Screenshot واقعی Dashboard</w:t>
+      </w:r>
+    </w:p>
+    <w:p>
+      <w:r>
+        <w:t>Sales Over Time: نمایش روند Net Sales در طول زمان و شناسایی افزایش‌ها و نقاط اوج فروش.</w:t>
+      </w:r>
+    </w:p>
+    <w:p>
+      <w:r>
+        <w:t>Gross Sales vs Net Sales: مقایسه فروش ناخالص و فروش خالص و مشاهده اثر تخفیف‌ها.</w:t>
+      </w:r>
+    </w:p>
+    <w:p>
+      <w:r>
+        <w:t>Discount Trend: نمایش روند Discount Amount در طول زمان.</w:t>
+      </w:r>
+    </w:p>
+    <w:p>
+      <w:pPr>
+        <w:rPr>
+          <w:rFonts w:hint="cs"/>
+          <w:rtl/>
+        </w:rPr>
+      </w:pPr>
+      <w:r>
+        <w:t>Sales by Quarter: مقایسه Net Sales در فصل‌های مختلف برای تحلیل الگوی فصلی فروش.</w:t>
+      </w:r>
+    </w:p>
+    <w:p/>
+    <w:p>
+      <w:pPr>
+        <w:rPr>
+          <w:rFonts w:hint="cs"/>
+          <w:rtl/>
+        </w:rPr>
+      </w:pPr>
+      <w:r>
+        <w:rPr>
+          <w:rFonts w:hint="cs"/>
+          <w:b/>
+          <w:color w:val="BF4E14" w:themeColor="accent2" w:themeShade="BF"/>
+          <w:sz w:val="28"/>
+          <w:szCs w:val="28"/>
+          <w:rtl/>
+        </w:rPr>
+        <w:t>13</w:t>
+      </w:r>
+      <w:r>
+        <w:rPr>
+          <w:b/>
+          <w:color w:val="BF4E14" w:themeColor="accent2" w:themeShade="BF"/>
+          <w:sz w:val="28"/>
+          <w:szCs w:val="28"/>
+        </w:rPr>
+        <w:t>.</w:t>
+      </w:r>
+      <w:r>
+        <w:rPr>
+          <w:rFonts w:hint="cs"/>
+          <w:b/>
+          <w:color w:val="BF4E14" w:themeColor="accent2" w:themeShade="BF"/>
+          <w:sz w:val="28"/>
+          <w:szCs w:val="28"/>
+          <w:rtl/>
+        </w:rPr>
+        <w:t>4</w:t>
+      </w:r>
+      <w:r>
+        <w:rPr>
+          <w:rFonts w:hint="cs"/>
+          <w:b/>
+          <w:color w:val="BF4E14" w:themeColor="accent2" w:themeShade="BF"/>
+          <w:sz w:val="28"/>
+          <w:szCs w:val="28"/>
+          <w:rtl/>
+        </w:rPr>
+        <w:t xml:space="preserve">-  </w:t>
+      </w:r>
+      <w:r>
+        <w:rPr>
+          <w:b/>
+          <w:color w:val="BF4E14" w:themeColor="accent2" w:themeShade="BF"/>
+          <w:sz w:val="26"/>
+        </w:rPr>
+        <w:t>Northwind - Sales Overview</w:t>
+      </w:r>
+    </w:p>
+    <w:p>
+      <w:pPr>
+        <w:jc w:val="center"/>
+      </w:pPr>
+      <w:r>
+        <w:rPr>
+          <w:noProof/>
+        </w:rPr>
+        <w:lastRenderedPageBreak/>
+        <w:drawing>
+          <wp:inline distT="0" distB="0" distL="0" distR="0" wp14:anchorId="21FB2C4C" wp14:editId="3BDF2E23">
+            <wp:extent cx="5806440" cy="3283133"/>
+            <wp:effectExtent l="0" t="0" r="0" b="0"/>
+            <wp:docPr id="3" name="Picture 3"/>
+            <wp:cNvGraphicFramePr>
+              <a:graphicFrameLocks xmlns:a="http://schemas.openxmlformats.org/drawingml/2006/main" noChangeAspect="1"/>
+            </wp:cNvGraphicFramePr>
+            <a:graphic xmlns:a="http://schemas.openxmlformats.org/drawingml/2006/main">
+              <a:graphicData uri="http://schemas.openxmlformats.org/drawingml/2006/picture">
+                <pic:pic xmlns:pic="http://schemas.openxmlformats.org/drawingml/2006/picture">
+                  <pic:nvPicPr>
+                    <pic:cNvPr id="0" name="Screenshot 2026-09-10 223937.png"/>
+                    <pic:cNvPicPr/>
+                  </pic:nvPicPr>
+                  <pic:blipFill>
+                    <a:blip r:embed="rId9"/>
+                    <a:stretch>
+                      <a:fillRect/>
+                    </a:stretch>
+                  </pic:blipFill>
+                  <pic:spPr>
+                    <a:xfrm>
+                      <a:off x="0" y="0"/>
+                      <a:ext cx="5806440" cy="3283133"/>
+                    </a:xfrm>
+                    <a:prstGeom prst="rect">
+                      <a:avLst/>
+                    </a:prstGeom>
+                  </pic:spPr>
+                </pic:pic>
+              </a:graphicData>
+            </a:graphic>
+          </wp:inline>
+        </w:drawing>
+      </w:r>
+    </w:p>
+    <w:p>
+      <w:pPr>
+        <w:jc w:val="center"/>
+      </w:pPr>
+      <w:r>
+        <w:rPr>
+          <w:i/>
+          <w:sz w:val="18"/>
+        </w:rPr>
+        <w:t>Screenshot واقعی Dashboard</w:t>
+      </w:r>
+    </w:p>
+    <w:p>
+      <w:r>
+        <w:t>Total Net Sales: نمایش مجموع فروش خالص پس از کسر Discount Amount.</w:t>
+      </w:r>
+    </w:p>
+    <w:p>
+      <w:r>
+        <w:t>Gross Sales: نمایش مجموع فروش ناخالص قبل از کسر تخفیف.</w:t>
+      </w:r>
+    </w:p>
+    <w:p>
+      <w:r>
+        <w:t>Discount Amount: نمایش مجموع مبلغ تخفیف اعمال‌شده روی فروش.</w:t>
+      </w:r>
+    </w:p>
+    <w:p>
+      <w:r>
+        <w:t>Total Orders: نمایش تعداد سفارش‌های یکتای موجود در FactSales.</w:t>
+      </w:r>
+    </w:p>
+    <w:p>
+      <w:pPr>
         <w:pStyle w:val="ListParagraph"/>
         <w:numPr>
           <w:ilvl w:val="0"/>
           <w:numId w:val="11"/>
         </w:numPr>
-        <w:rPr>
-          <w:rFonts w:cs="B Nazanin"/>
-          <w:b/>
-          <w:bCs/>
-          <w:color w:val="4C94D8" w:themeColor="text2" w:themeTint="80"/>
-          <w:sz w:val="32"/>
-          <w:szCs w:val="32"/>
-        </w:rPr>
       </w:pPr>
       <w:r>
         <w:rPr>
@@ -6173,25 +6710,36 @@
           <w:color w:val="4C94D8" w:themeColor="text2" w:themeTint="80"/>
           <w:sz w:val="32"/>
           <w:szCs w:val="32"/>
-        </w:rPr>
-        <w:t xml:space="preserve"> Validation</w:t>
-      </w:r>
-    </w:p>
-    <w:p>
-      <w:pPr>
-        <w:rPr>
-          <w:rFonts w:cs="B Nazanin"/>
-          <w:sz w:val="32"/>
-          <w:szCs w:val="32"/>
-        </w:rPr>
-      </w:pPr>
-      <w:r>
-        <w:rPr>
-          <w:rFonts w:cs="B Nazanin"/>
-          <w:sz w:val="32"/>
-          <w:szCs w:val="32"/>
-        </w:rPr>
-        <w:lastRenderedPageBreak/>
+          <w:rtl/>
+        </w:rPr>
+        <w:t xml:space="preserve"> </w:t>
+      </w:r>
+      <w:r>
+        <w:rPr>
+          <w:rFonts w:cs="B Nazanin" w:hint="cs"/>
+          <w:b/>
+          <w:bCs/>
+          <w:color w:val="4C94D8" w:themeColor="text2" w:themeTint="80"/>
+          <w:sz w:val="32"/>
+          <w:szCs w:val="32"/>
+        </w:rPr>
+        <w:t>Validation</w:t>
+      </w:r>
+    </w:p>
+    <w:p>
+      <w:pPr>
+        <w:rPr>
+          <w:rFonts w:cs="B Nazanin"/>
+          <w:sz w:val="32"/>
+          <w:szCs w:val="32"/>
+        </w:rPr>
+      </w:pPr>
+      <w:r>
+        <w:rPr>
+          <w:rFonts w:cs="B Nazanin"/>
+          <w:sz w:val="32"/>
+          <w:szCs w:val="32"/>
+        </w:rPr>
         <w:t>Validation</w:t>
       </w:r>
       <w:r>
@@ -6391,6 +6939,7 @@
           <w:sz w:val="32"/>
           <w:szCs w:val="32"/>
         </w:rPr>
+        <w:lastRenderedPageBreak/>
         <w:t xml:space="preserve">consistency </w:t>
       </w:r>
       <w:r>
@@ -6693,7 +7242,6 @@
           <w:sz w:val="32"/>
           <w:szCs w:val="32"/>
         </w:rPr>
-        <w:lastRenderedPageBreak/>
         <w:t>AllocatedFreight   = 64932.60</w:t>
       </w:r>
     </w:p>
@@ -6833,6 +7381,7 @@
           <w:sz w:val="32"/>
           <w:szCs w:val="32"/>
         </w:rPr>
+        <w:lastRenderedPageBreak/>
         <w:t>northwind-redis</w:t>
       </w:r>
     </w:p>
@@ -7275,7 +7824,6 @@
           <w:sz w:val="32"/>
           <w:szCs w:val="32"/>
         </w:rPr>
-        <w:lastRenderedPageBreak/>
         <w:t>Credential</w:t>
       </w:r>
       <w:r>
@@ -7605,6 +8153,7 @@
           <w:sz w:val="32"/>
           <w:szCs w:val="32"/>
         </w:rPr>
+        <w:lastRenderedPageBreak/>
         <w:t>├</w:t>
       </w:r>
       <w:r>
@@ -8001,7 +8550,6 @@
           <w:sz w:val="32"/>
           <w:szCs w:val="32"/>
         </w:rPr>
-        <w:lastRenderedPageBreak/>
         <w:t>87ae9c2 Initial Northwind ETL pipeline</w:t>
       </w:r>
     </w:p>
@@ -8211,6 +8759,7 @@
           <w:sz w:val="32"/>
           <w:szCs w:val="32"/>
         </w:rPr>
+        <w:lastRenderedPageBreak/>
         <w:t xml:space="preserve">                         Daily Full Load</w:t>
       </w:r>
     </w:p>
@@ -8481,92 +9030,263 @@
           <w:sz w:val="32"/>
           <w:szCs w:val="32"/>
         </w:rPr>
+        <w:t xml:space="preserve">                    │ Dimensions SCD2     │</w:t>
+      </w:r>
+    </w:p>
+    <w:p>
+      <w:pPr>
+        <w:rPr>
+          <w:rFonts w:cs="B Nazanin"/>
+          <w:sz w:val="32"/>
+          <w:szCs w:val="32"/>
+        </w:rPr>
+      </w:pPr>
+      <w:r>
+        <w:rPr>
+          <w:rFonts w:cs="B Nazanin"/>
+          <w:sz w:val="32"/>
+          <w:szCs w:val="32"/>
+        </w:rPr>
+        <w:t xml:space="preserve">                    │ FactSales           │</w:t>
+      </w:r>
+    </w:p>
+    <w:p>
+      <w:pPr>
+        <w:rPr>
+          <w:rFonts w:cs="B Nazanin"/>
+          <w:sz w:val="32"/>
+          <w:szCs w:val="32"/>
+        </w:rPr>
+      </w:pPr>
+      <w:r>
+        <w:rPr>
+          <w:rFonts w:cs="B Nazanin"/>
+          <w:sz w:val="32"/>
+          <w:szCs w:val="32"/>
+        </w:rPr>
+        <w:t xml:space="preserve">                    └──────────</w:t>
+      </w:r>
+      <w:r>
+        <w:rPr>
+          <w:rFonts w:ascii="MS Gothic" w:eastAsia="MS Gothic" w:hAnsi="MS Gothic" w:cs="B Nazanin" w:hint="eastAsia"/>
+          <w:sz w:val="32"/>
+          <w:szCs w:val="32"/>
+        </w:rPr>
+        <w:t>┬</w:t>
+      </w:r>
+      <w:r>
+        <w:rPr>
+          <w:rFonts w:ascii="Aptos" w:hAnsi="Aptos" w:cs="B Nazanin"/>
+          <w:sz w:val="32"/>
+          <w:szCs w:val="32"/>
+        </w:rPr>
+        <w:t>──────────┘</w:t>
+      </w:r>
+    </w:p>
+    <w:p>
+      <w:pPr>
+        <w:rPr>
+          <w:rFonts w:cs="B Nazanin"/>
+          <w:sz w:val="32"/>
+          <w:szCs w:val="32"/>
+        </w:rPr>
+      </w:pPr>
+      <w:r>
+        <w:rPr>
+          <w:rFonts w:cs="B Nazanin"/>
+          <w:sz w:val="32"/>
+          <w:szCs w:val="32"/>
+        </w:rPr>
+        <w:t xml:space="preserve">                               │</w:t>
+      </w:r>
+    </w:p>
+    <w:p>
+      <w:pPr>
+        <w:rPr>
+          <w:rFonts w:cs="B Nazanin"/>
+          <w:sz w:val="32"/>
+          <w:szCs w:val="32"/>
+        </w:rPr>
+      </w:pPr>
+      <w:r>
+        <w:rPr>
+          <w:rFonts w:cs="B Nazanin"/>
+          <w:sz w:val="32"/>
+          <w:szCs w:val="32"/>
+        </w:rPr>
+        <w:t xml:space="preserve">                               </w:t>
+      </w:r>
+      <w:r>
+        <w:rPr>
+          <w:rFonts w:ascii="Arial" w:hAnsi="Arial" w:cs="B Nazanin"/>
+          <w:sz w:val="32"/>
+          <w:szCs w:val="32"/>
+        </w:rPr>
+        <w:t>▼</w:t>
+      </w:r>
+    </w:p>
+    <w:p>
+      <w:pPr>
+        <w:rPr>
+          <w:rFonts w:cs="B Nazanin"/>
+          <w:sz w:val="32"/>
+          <w:szCs w:val="32"/>
+        </w:rPr>
+      </w:pPr>
+      <w:r>
+        <w:rPr>
+          <w:rFonts w:cs="B Nazanin"/>
+          <w:sz w:val="32"/>
+          <w:szCs w:val="32"/>
+        </w:rPr>
+        <w:t xml:space="preserve">                    ┌─────────────────────┐</w:t>
+      </w:r>
+    </w:p>
+    <w:p>
+      <w:pPr>
+        <w:rPr>
+          <w:rFonts w:cs="B Nazanin"/>
+          <w:sz w:val="32"/>
+          <w:szCs w:val="32"/>
+        </w:rPr>
+      </w:pPr>
+      <w:r>
+        <w:rPr>
+          <w:rFonts w:cs="B Nazanin"/>
+          <w:sz w:val="32"/>
+          <w:szCs w:val="32"/>
+        </w:rPr>
+        <w:t xml:space="preserve">                    │ Grafana             │</w:t>
+      </w:r>
+    </w:p>
+    <w:p>
+      <w:pPr>
+        <w:rPr>
+          <w:rFonts w:cs="B Nazanin"/>
+          <w:sz w:val="32"/>
+          <w:szCs w:val="32"/>
+        </w:rPr>
+      </w:pPr>
+      <w:r>
+        <w:rPr>
+          <w:rFonts w:cs="B Nazanin"/>
+          <w:sz w:val="32"/>
+          <w:szCs w:val="32"/>
+        </w:rPr>
         <w:lastRenderedPageBreak/>
-        <w:t xml:space="preserve">                    │ Dimensions SCD2     │</w:t>
-      </w:r>
-    </w:p>
-    <w:p>
-      <w:pPr>
-        <w:rPr>
-          <w:rFonts w:cs="B Nazanin"/>
-          <w:sz w:val="32"/>
-          <w:szCs w:val="32"/>
-        </w:rPr>
-      </w:pPr>
-      <w:r>
-        <w:rPr>
-          <w:rFonts w:cs="B Nazanin"/>
-          <w:sz w:val="32"/>
-          <w:szCs w:val="32"/>
-        </w:rPr>
-        <w:t xml:space="preserve">                    │ FactSales           │</w:t>
-      </w:r>
-    </w:p>
-    <w:p>
-      <w:pPr>
-        <w:rPr>
-          <w:rFonts w:cs="B Nazanin"/>
-          <w:sz w:val="32"/>
-          <w:szCs w:val="32"/>
-        </w:rPr>
-      </w:pPr>
-      <w:r>
-        <w:rPr>
-          <w:rFonts w:cs="B Nazanin"/>
-          <w:sz w:val="32"/>
-          <w:szCs w:val="32"/>
-        </w:rPr>
-        <w:t xml:space="preserve">                    └──────────</w:t>
-      </w:r>
-      <w:r>
-        <w:rPr>
-          <w:rFonts w:ascii="MS Gothic" w:eastAsia="MS Gothic" w:hAnsi="MS Gothic" w:cs="B Nazanin" w:hint="eastAsia"/>
-          <w:sz w:val="32"/>
-          <w:szCs w:val="32"/>
-        </w:rPr>
-        <w:t>┬</w:t>
-      </w:r>
-      <w:r>
-        <w:rPr>
-          <w:rFonts w:ascii="Aptos" w:hAnsi="Aptos" w:cs="B Nazanin"/>
-          <w:sz w:val="32"/>
-          <w:szCs w:val="32"/>
-        </w:rPr>
-        <w:t>──────────┘</w:t>
-      </w:r>
-    </w:p>
-    <w:p>
-      <w:pPr>
-        <w:rPr>
-          <w:rFonts w:cs="B Nazanin"/>
-          <w:sz w:val="32"/>
-          <w:szCs w:val="32"/>
-        </w:rPr>
-      </w:pPr>
-      <w:r>
-        <w:rPr>
-          <w:rFonts w:cs="B Nazanin"/>
-          <w:sz w:val="32"/>
-          <w:szCs w:val="32"/>
-        </w:rPr>
-        <w:t xml:space="preserve">                               │</w:t>
-      </w:r>
-    </w:p>
-    <w:p>
-      <w:pPr>
-        <w:rPr>
-          <w:rFonts w:cs="B Nazanin"/>
-          <w:sz w:val="32"/>
-          <w:szCs w:val="32"/>
-        </w:rPr>
-      </w:pPr>
-      <w:r>
-        <w:rPr>
-          <w:rFonts w:cs="B Nazanin"/>
-          <w:sz w:val="32"/>
-          <w:szCs w:val="32"/>
-        </w:rPr>
-        <w:t xml:space="preserve">                               </w:t>
+        <w:t xml:space="preserve">                    │ Analytics           │</w:t>
+      </w:r>
+    </w:p>
+    <w:p>
+      <w:pPr>
+        <w:rPr>
+          <w:rFonts w:cs="B Nazanin"/>
+          <w:sz w:val="32"/>
+          <w:szCs w:val="32"/>
+        </w:rPr>
+      </w:pPr>
+      <w:r>
+        <w:rPr>
+          <w:rFonts w:cs="B Nazanin"/>
+          <w:sz w:val="32"/>
+          <w:szCs w:val="32"/>
+        </w:rPr>
+        <w:t xml:space="preserve">                    └─────────────────────┘</w:t>
+      </w:r>
+    </w:p>
+    <w:p>
+      <w:pPr>
+        <w:rPr>
+          <w:rFonts w:cs="B Nazanin"/>
+          <w:sz w:val="32"/>
+          <w:szCs w:val="32"/>
+        </w:rPr>
+      </w:pPr>
+    </w:p>
+    <w:p>
+      <w:pPr>
+        <w:rPr>
+          <w:rFonts w:cs="B Nazanin"/>
+          <w:sz w:val="32"/>
+          <w:szCs w:val="32"/>
+        </w:rPr>
+      </w:pPr>
+    </w:p>
+    <w:p>
+      <w:pPr>
+        <w:rPr>
+          <w:rFonts w:cs="B Nazanin"/>
+          <w:sz w:val="32"/>
+          <w:szCs w:val="32"/>
+        </w:rPr>
+      </w:pPr>
+      <w:r>
+        <w:rPr>
+          <w:rFonts w:cs="B Nazanin"/>
+          <w:sz w:val="32"/>
+          <w:szCs w:val="32"/>
+        </w:rPr>
+        <w:t>CDC Path:</w:t>
+      </w:r>
+    </w:p>
+    <w:p>
+      <w:pPr>
+        <w:rPr>
+          <w:rFonts w:cs="B Nazanin"/>
+          <w:sz w:val="32"/>
+          <w:szCs w:val="32"/>
+        </w:rPr>
+      </w:pPr>
+    </w:p>
+    <w:p>
+      <w:pPr>
+        <w:rPr>
+          <w:rFonts w:cs="B Nazanin"/>
+          <w:sz w:val="32"/>
+          <w:szCs w:val="32"/>
+        </w:rPr>
+      </w:pPr>
+      <w:r>
+        <w:rPr>
+          <w:rFonts w:cs="B Nazanin"/>
+          <w:sz w:val="32"/>
+          <w:szCs w:val="32"/>
+        </w:rPr>
+        <w:t>SQL Server CDC</w:t>
+      </w:r>
+    </w:p>
+    <w:p>
+      <w:pPr>
+        <w:rPr>
+          <w:rFonts w:cs="B Nazanin"/>
+          <w:sz w:val="32"/>
+          <w:szCs w:val="32"/>
+        </w:rPr>
+      </w:pPr>
+      <w:r>
+        <w:rPr>
+          <w:rFonts w:cs="B Nazanin"/>
+          <w:sz w:val="32"/>
+          <w:szCs w:val="32"/>
+        </w:rPr>
+        <w:t xml:space="preserve">      │</w:t>
+      </w:r>
+    </w:p>
+    <w:p>
+      <w:pPr>
+        <w:rPr>
+          <w:rFonts w:cs="B Nazanin"/>
+          <w:sz w:val="32"/>
+          <w:szCs w:val="32"/>
+        </w:rPr>
+      </w:pPr>
+      <w:r>
+        <w:rPr>
+          <w:rFonts w:cs="B Nazanin"/>
+          <w:sz w:val="32"/>
+          <w:szCs w:val="32"/>
+        </w:rPr>
+        <w:t xml:space="preserve">      </w:t>
       </w:r>
       <w:r>
         <w:rPr>
@@ -8591,119 +9311,7 @@
           <w:sz w:val="32"/>
           <w:szCs w:val="32"/>
         </w:rPr>
-        <w:t xml:space="preserve">                    ┌─────────────────────┐</w:t>
-      </w:r>
-    </w:p>
-    <w:p>
-      <w:pPr>
-        <w:rPr>
-          <w:rFonts w:cs="B Nazanin"/>
-          <w:sz w:val="32"/>
-          <w:szCs w:val="32"/>
-        </w:rPr>
-      </w:pPr>
-      <w:r>
-        <w:rPr>
-          <w:rFonts w:cs="B Nazanin"/>
-          <w:sz w:val="32"/>
-          <w:szCs w:val="32"/>
-        </w:rPr>
-        <w:t xml:space="preserve">                    │ Grafana             │</w:t>
-      </w:r>
-    </w:p>
-    <w:p>
-      <w:pPr>
-        <w:rPr>
-          <w:rFonts w:cs="B Nazanin"/>
-          <w:sz w:val="32"/>
-          <w:szCs w:val="32"/>
-        </w:rPr>
-      </w:pPr>
-      <w:r>
-        <w:rPr>
-          <w:rFonts w:cs="B Nazanin"/>
-          <w:sz w:val="32"/>
-          <w:szCs w:val="32"/>
-        </w:rPr>
-        <w:t xml:space="preserve">                    │ Analytics           │</w:t>
-      </w:r>
-    </w:p>
-    <w:p>
-      <w:pPr>
-        <w:rPr>
-          <w:rFonts w:cs="B Nazanin"/>
-          <w:sz w:val="32"/>
-          <w:szCs w:val="32"/>
-        </w:rPr>
-      </w:pPr>
-      <w:r>
-        <w:rPr>
-          <w:rFonts w:cs="B Nazanin"/>
-          <w:sz w:val="32"/>
-          <w:szCs w:val="32"/>
-        </w:rPr>
-        <w:t xml:space="preserve">                    └─────────────────────┘</w:t>
-      </w:r>
-    </w:p>
-    <w:p>
-      <w:pPr>
-        <w:rPr>
-          <w:rFonts w:cs="B Nazanin"/>
-          <w:sz w:val="32"/>
-          <w:szCs w:val="32"/>
-        </w:rPr>
-      </w:pPr>
-    </w:p>
-    <w:p>
-      <w:pPr>
-        <w:rPr>
-          <w:rFonts w:cs="B Nazanin"/>
-          <w:sz w:val="32"/>
-          <w:szCs w:val="32"/>
-        </w:rPr>
-      </w:pPr>
-    </w:p>
-    <w:p>
-      <w:pPr>
-        <w:rPr>
-          <w:rFonts w:cs="B Nazanin"/>
-          <w:sz w:val="32"/>
-          <w:szCs w:val="32"/>
-        </w:rPr>
-      </w:pPr>
-      <w:r>
-        <w:rPr>
-          <w:rFonts w:cs="B Nazanin"/>
-          <w:sz w:val="32"/>
-          <w:szCs w:val="32"/>
-        </w:rPr>
-        <w:t>CDC Path:</w:t>
-      </w:r>
-    </w:p>
-    <w:p>
-      <w:pPr>
-        <w:rPr>
-          <w:rFonts w:cs="B Nazanin"/>
-          <w:sz w:val="32"/>
-          <w:szCs w:val="32"/>
-        </w:rPr>
-      </w:pPr>
-    </w:p>
-    <w:p>
-      <w:pPr>
-        <w:rPr>
-          <w:rFonts w:cs="B Nazanin"/>
-          <w:sz w:val="32"/>
-          <w:szCs w:val="32"/>
-        </w:rPr>
-      </w:pPr>
-      <w:r>
-        <w:rPr>
-          <w:rFonts w:cs="B Nazanin"/>
-          <w:sz w:val="32"/>
-          <w:szCs w:val="32"/>
-        </w:rPr>
-        <w:t>SQL Server CDC</w:t>
+        <w:t>CDC Raw</w:t>
       </w:r>
     </w:p>
     <w:p>
@@ -8762,7 +9370,7 @@
           <w:sz w:val="32"/>
           <w:szCs w:val="32"/>
         </w:rPr>
-        <w:t>CDC Raw</w:t>
+        <w:t>CDC Clean</w:t>
       </w:r>
     </w:p>
     <w:p>
@@ -8796,66 +9404,6 @@
           <w:sz w:val="32"/>
           <w:szCs w:val="32"/>
         </w:rPr>
-        <w:t xml:space="preserve">      </w:t>
-      </w:r>
-      <w:r>
-        <w:rPr>
-          <w:rFonts w:ascii="Arial" w:hAnsi="Arial" w:cs="B Nazanin"/>
-          <w:sz w:val="32"/>
-          <w:szCs w:val="32"/>
-        </w:rPr>
-        <w:t>▼</w:t>
-      </w:r>
-    </w:p>
-    <w:p>
-      <w:pPr>
-        <w:rPr>
-          <w:rFonts w:cs="B Nazanin"/>
-          <w:sz w:val="32"/>
-          <w:szCs w:val="32"/>
-        </w:rPr>
-      </w:pPr>
-      <w:r>
-        <w:rPr>
-          <w:rFonts w:cs="B Nazanin"/>
-          <w:sz w:val="32"/>
-          <w:szCs w:val="32"/>
-        </w:rPr>
-        <w:t>CDC Clean</w:t>
-      </w:r>
-    </w:p>
-    <w:p>
-      <w:pPr>
-        <w:rPr>
-          <w:rFonts w:cs="B Nazanin"/>
-          <w:sz w:val="32"/>
-          <w:szCs w:val="32"/>
-        </w:rPr>
-      </w:pPr>
-      <w:r>
-        <w:rPr>
-          <w:rFonts w:cs="B Nazanin"/>
-          <w:sz w:val="32"/>
-          <w:szCs w:val="32"/>
-        </w:rPr>
-        <w:t xml:space="preserve">      │</w:t>
-      </w:r>
-    </w:p>
-    <w:p>
-      <w:pPr>
-        <w:rPr>
-          <w:rFonts w:cs="B Nazanin"/>
-          <w:sz w:val="32"/>
-          <w:szCs w:val="32"/>
-        </w:rPr>
-      </w:pPr>
-      <w:r>
-        <w:rPr>
-          <w:rFonts w:cs="B Nazanin"/>
-          <w:sz w:val="32"/>
-          <w:szCs w:val="32"/>
-        </w:rPr>
-        <w:lastRenderedPageBreak/>
         <w:t xml:space="preserve">      </w:t>
       </w:r>
       <w:r>
@@ -9028,6 +9576,7 @@
           <w:sz w:val="32"/>
           <w:szCs w:val="32"/>
         </w:rPr>
+        <w:lastRenderedPageBreak/>
         <w:t xml:space="preserve">Airflow </w:t>
       </w:r>
       <w:r>
@@ -10214,8 +10763,8 @@
   <w:abstractNum w:abstractNumId="4" w15:restartNumberingAfterBreak="0">
     <w:nsid w:val="55B676DE"/>
     <w:multiLevelType w:val="hybridMultilevel"/>
-    <w:tmpl w:val="7CA42C7A"/>
-    <w:lvl w:ilvl="0" w:tplc="0409000F">
+    <w:tmpl w:val="98BCF6FC"/>
+    <w:lvl w:ilvl="0" w:tplc="D4403DDA">
       <w:start w:val="1"/>
       <w:numFmt w:val="decimal"/>
       <w:lvlText w:val="%1."/>
@@ -10225,6 +10774,9 @@
       </w:pPr>
       <w:rPr>
         <w:rFonts w:hint="default"/>
+        <w:color w:val="4C94D8" w:themeColor="text2" w:themeTint="80"/>
+        <w:sz w:val="32"/>
+        <w:szCs w:val="32"/>
       </w:rPr>
     </w:lvl>
     <w:lvl w:ilvl="1" w:tplc="04090019" w:tentative="1">
@@ -12443,4 +12995,16 @@
     </a:ext>
   </a:extLst>
 </a:theme>
+</file>
+
+<file path=customXml/item1.xml><?xml version="1.0" encoding="utf-8"?>
+<b:Sources xmlns:b="http://schemas.openxmlformats.org/officeDocument/2006/bibliography" xmlns="http://schemas.openxmlformats.org/officeDocument/2006/bibliography" SelectedStyle="\APASixthEditionOfficeOnline.xsl" StyleName="APA" Version="6"/>
+</file>
+
+<file path=customXml/itemProps1.xml><?xml version="1.0" encoding="utf-8"?>
+<ds:datastoreItem xmlns:ds="http://schemas.openxmlformats.org/officeDocument/2006/customXml" ds:itemID="{A980F63A-793C-491A-B670-4BF55E9FA4FB}">
+  <ds:schemaRefs>
+    <ds:schemaRef ds:uri="http://schemas.openxmlformats.org/officeDocument/2006/bibliography"/>
+  </ds:schemaRefs>
+</ds:datastoreItem>
 </file>
</xml_diff>